<commit_message>
Add India country profile; render narrative paragraph breaks as real paragraphs
India went through research, three independent verifiers and a resolution
pass (41 corrections, logged in resolution_log). Multi-paragraph narratives
previously rendered as line breaks inside one paragraph with no spacing.

Co-Authored-By: Claude Opus 5.5 <noreply@anthropic.com>
Claude-Session: https://claude.ai/code/session_01ChEN58PbdXFZmwUoBZYBRb
</commit_message>
<xml_diff>
--- a/output/China_Profile_DRAFT.docx
+++ b/output/China_Profile_DRAFT.docx
@@ -1208,26 +1208,40 @@
     <w:p>
       <w:r>
         <w:t>US health system engagement in China is real but uneven, ranging from active consulting relationships and long-running academic exchanges to branded ventures whose current operating status is difficult to confirm from public sources, and at least one case where the underlying facility has closed while the parent relationship persists in some form.</w:t>
-        <w:br/>
-        <w:br/>
+      </w:r>
+    </w:p>
+    <w:p>
+      <w:r>
         <w:t>Mayo Clinic's WuXi Diagnostics joint venture with WuXi AppTec, launched in 2018 to build a clinical diagnostics platform for the Chinese market, opened its first research and diagnostic testing facility in Rochester, Minnesota in 2019. That Rochester facility has since closed. However, Mayo Clinic told the Post Bulletin, its hometown newspaper, in February 2024 that the joint venture itself still exists, even as the relationship has come under increased political scrutiny amid a proposed federal BIOSECURE Act naming WuXi entities as national security concerns. The accurate picture is therefore mixed: the US-based R&amp;D facility has definitively closed, but whether the joint venture entity continues to operate at meaningful scale in China is not independently confirmed beyond Mayo's own 2024 statement that it still exists.</w:t>
-        <w:br/>
-        <w:br/>
+      </w:r>
+    </w:p>
+    <w:p>
+      <w:r>
         <w:t>Cleveland Clinic has an active relationship in China through two channels. First, Cleveland Clinic Connected, its international clinical-affiliation program, partnered with Luye Medical Group beginning in 2018 to develop Shanghai Luye Lilan Hospital, with Luye Medical as the program's inaugural member. The hospital's opening was delayed by the COVID-19 pandemic from an original 2024 target to 2025; current public sources point to a 2025 opening target but do not confirm the hospital has actually opened as of this writing. Second, Cleveland Clinic appointed an in-country patient representative for China in November 2022 as part of a broader expansion of its global patient-services network, giving it an ongoing, lower-intensity presence independent of the hospital development.</w:t>
-        <w:br/>
-        <w:br/>
+      </w:r>
+    </w:p>
+    <w:p>
+      <w:r>
         <w:t>MD Anderson Cancer Center entered a ten-year cooperation agreement with Concord Medical Services, together with a proton therapy training agreement, to support MD Anderson-branded cancer centers in China, including the Wuxi Meizhong Jiahe Cancer Center along with related Concord Medical facilities in Datong and Shanghai. These facilities continue to appear as active parts of Concord Medical's hospital network in the company's recent SEC filings, indicating the underlying centers are still operating. However, the most direct public confirmation of the MD Anderson branding and training relationship itself dates to approximately 2021, so while the facilities appear to remain operational, the current status of the formal MD Anderson partnership as originally structured cannot be independently verified from recent sources.</w:t>
-        <w:br/>
-        <w:br/>
+      </w:r>
+    </w:p>
+    <w:p>
+      <w:r>
         <w:t>Among the other major US systems, the picture is more mixed than a blanket claim of no partnerships would suggest. UCLA Health has an active, multi-decade relationship in China: it has held a master affiliation agreement with Zhejiang University since 2001, expanded into a formal academic medical exchange with the university's Second Affiliated Hospital in 2009, and resumed a resident clinical rotation there in March 2024 after a pandemic-driven hiatus. UCLA Health specialists have also been providing ongoing consulting, covering design, staffing, policy, and clinical quality, to Guangzhou R&amp;F Hospital, which is intended to become UCLA Health's first overseas affiliated hospital, though that project's current construction and opening timeline is unconfirmed. UPMC pursued a high-profile 20-year hospital-management joint venture with Wanda Group announced in 2019, intended to build a network of facilities starting with a 500-bed tertiary hospital in Chengdu, and separately signed a shorter-term cancer-care agreement in Hainan; no source found confirms continued active status of either arrangement between 2024 and 2026. Mass General Brigham's China history includes a decade-long relationship with Jiahui Health in Shanghai, but its earlier, higher-profile hospital venture through Brigham Health has been described in subsequent reporting as a commercial disappointment, and no current 2024 to 2026 China partnership activity was found. Houston Methodist, NewYork-Presbyterian, and Northwestern Medicine show no evidence of an active China hospital partnership in current public sources; Northwestern Medicine's most recent major international collaboration, announced in 2024, is with The London Clinic in the United Kingdom rather than a Chinese partner.</w:t>
-        <w:br/>
-        <w:br/>
+      </w:r>
+    </w:p>
+    <w:p>
+      <w:r>
         <w:t>Johns Hopkins Medicine International does not have a branded hospital or equity joint venture in China, but it maintains active consulting relationships that a simple no-partnership framing would miss. It has provided hospital policy, procedure, and management consulting to China Northwest International Medical Center in Xi'an since a formal agreement signed in 2018, and since 2016 has consulted with Nanjing Drum Tower Hospital on surgery, medicine, and obstetrics residency training programs, a three-way collaboration that also involves Taikang Life, one of China's largest non-state insurance groups. These are lower-intensity, fee-based advisory engagements rather than co-branded clinical facilities, but they represent genuine, ongoing points of contact between Johns Hopkins and Chinese healthcare institutions.</w:t>
-        <w:br/>
-        <w:br/>
+      </w:r>
+    </w:p>
+    <w:p>
+      <w:r>
         <w:t>Memorial Sloan Kettering's collaboration with the Chinese Thoracic Oncology Group is a longer-running and more established series than a single early-edition framing implies. MSK and CTONG have held an annual joint symposium since roughly 2018 focused on international clinical trials, regulatory harmonization, and precision cancer therapies. A fifth annual edition was held virtually on December 2, 2022, drawing an audience of roughly 20,000 across Guangzhou and New York, and the collaboration has continued in subsequent years with joint public statements on accelerating international cancer drug approvals.</w:t>
-        <w:br/>
-        <w:br/>
+      </w:r>
+    </w:p>
+    <w:p>
+      <w:r>
         <w:t>For Cedars-Sinai International, the pattern across these cases is instructive: durable China engagement has tended to favor lower-capital models, consulting, academic exchange, clinical-society collaboration, over the equity joint ventures and branded hospital builds that have more often stalled, been delayed for years, or quietly wound down.</w:t>
       </w:r>
     </w:p>

</xml_diff>

<commit_message>
Add cover map, linked table of contents, and numbered citations with separate sources document
Citations use {{n}} markers per section, renumbered document-wide and listed in
<name>_SOURCES.docx. Cover maps use Natural Earth 1:110m shapes (public domain).

Co-Authored-By: Claude Opus 5.5 <noreply@anthropic.com>
Claude-Session: https://claude.ai/code/session_01ChEN58PbdXFZmwUoBZYBRb
</commit_message>
<xml_diff>
--- a/output/China_Profile_DRAFT.docx
+++ b/output/China_Profile_DRAFT.docx
@@ -4,12 +4,7 @@
   <w:body>
     <w:p>
       <w:pPr>
-        <w:spacing w:after="1200"/>
-      </w:pPr>
-    </w:p>
-    <w:p>
-      <w:pPr>
-        <w:spacing w:after="40"/>
+        <w:spacing w:before="800" w:after="40"/>
       </w:pPr>
       <w:r>
         <w:rPr>
@@ -22,25 +17,620 @@
     </w:p>
     <w:p>
       <w:pPr>
-        <w:spacing w:after="600"/>
+        <w:spacing w:after="560"/>
       </w:pPr>
       <w:r>
         <w:rPr>
           <w:b/>
           <w:color w:val="D91F2C"/>
-          <w:sz w:val="72"/>
+          <w:sz w:val="80"/>
         </w:rPr>
         <w:t>China</w:t>
       </w:r>
     </w:p>
     <w:p>
       <w:r>
+        <w:drawing>
+          <wp:inline xmlns:a="http://schemas.openxmlformats.org/drawingml/2006/main" xmlns:pic="http://schemas.openxmlformats.org/drawingml/2006/picture">
+            <wp:extent cx="5976000" cy="2689200"/>
+            <wp:docPr id="1" name="Picture 1"/>
+            <wp:cNvGraphicFramePr>
+              <a:graphicFrameLocks noChangeAspect="1"/>
+            </wp:cNvGraphicFramePr>
+            <a:graphic>
+              <a:graphicData uri="http://schemas.openxmlformats.org/drawingml/2006/picture">
+                <pic:pic>
+                  <pic:nvPicPr>
+                    <pic:cNvPr id="0" name="China_cover_map.png"/>
+                    <pic:cNvPicPr/>
+                  </pic:nvPicPr>
+                  <pic:blipFill>
+                    <a:blip r:embed="rId10"/>
+                    <a:stretch>
+                      <a:fillRect/>
+                    </a:stretch>
+                  </pic:blipFill>
+                  <pic:spPr>
+                    <a:xfrm>
+                      <a:off x="0" y="0"/>
+                      <a:ext cx="5976000" cy="2689200"/>
+                    </a:xfrm>
+                    <a:prstGeom prst="rect"/>
+                  </pic:spPr>
+                </pic:pic>
+              </a:graphicData>
+            </a:graphic>
+          </wp:inline>
+        </w:drawing>
+      </w:r>
+    </w:p>
+    <w:p>
+      <w:pPr>
+        <w:spacing w:before="480"/>
+      </w:pPr>
+      <w:r>
         <w:rPr>
           <w:i/>
           <w:color w:val="6E6E6E"/>
           <w:sz w:val="20"/>
         </w:rPr>
-        <w:t>Draft prepared 2026-09-24. Public-source sections were researched and independently fact-checked before this draft was written; the CSI Assessment section requires completion from Cedars-Sinai's internal data.</w:t>
+        <w:t>Draft prepared 2026-09-24. Superscript numbers refer to the numbered sources in the companion document, China_Profile_DRAFT_SOURCES.docx. The CSI Assessment section requires completion from Cedars-Sinai's internal data.</w:t>
+      </w:r>
+    </w:p>
+    <w:p>
+      <w:pPr>
+        <w:spacing w:before="1200"/>
+        <w:jc w:val="right"/>
+      </w:pPr>
+      <w:r>
+        <w:rPr>
+          <w:b/>
+          <w:color w:val="6E6E6E"/>
+          <w:sz w:val="22"/>
+        </w:rPr>
+        <w:t>Cedars-Sinai  |  INTERNATIONAL</w:t>
+      </w:r>
+    </w:p>
+    <w:p>
+      <w:r>
+        <w:br w:type="page"/>
+      </w:r>
+    </w:p>
+    <w:p>
+      <w:pPr>
+        <w:spacing w:after="280"/>
+      </w:pPr>
+      <w:r>
+        <w:rPr>
+          <w:color w:val="D91F2C"/>
+          <w:sz w:val="40"/>
+        </w:rPr>
+        <w:t>Table of Contents</w:t>
+      </w:r>
+    </w:p>
+    <w:p>
+      <w:pPr>
+        <w:tabs>
+          <w:tab w:pos="9411" w:val="right" w:leader="dot"/>
+        </w:tabs>
+        <w:spacing w:after="120" w:before="160"/>
+        <w:ind w:left="0"/>
+      </w:pPr>
+      <w:hyperlink w:anchor="_sec1">
+        <w:r>
+          <w:rPr>
+            <w:b/>
+          </w:rPr>
+          <w:t xml:space="preserve">Country Overview</w:t>
+        </w:r>
+      </w:hyperlink>
+      <w:r>
+        <w:tab/>
+      </w:r>
+      <w:r>
+        <w:fldChar w:fldCharType="begin"/>
+      </w:r>
+      <w:r>
+        <w:instrText xml:space="preserve"> PAGEREF _sec1 \h </w:instrText>
+      </w:r>
+      <w:r>
+        <w:fldChar w:fldCharType="separate"/>
+      </w:r>
+      <w:r>
+        <w:t/>
+      </w:r>
+      <w:r>
+        <w:fldChar w:fldCharType="end"/>
+      </w:r>
+    </w:p>
+    <w:p>
+      <w:pPr>
+        <w:tabs>
+          <w:tab w:pos="9411" w:val="right" w:leader="dot"/>
+        </w:tabs>
+        <w:spacing w:after="80" w:before="0"/>
+        <w:ind w:left="340"/>
+      </w:pPr>
+      <w:hyperlink w:anchor="_sec2">
+        <w:r>
+          <w:rPr>
+            <w:i/>
+          </w:rPr>
+          <w:t xml:space="preserve">Population and Demographics</w:t>
+        </w:r>
+      </w:hyperlink>
+      <w:r>
+        <w:tab/>
+      </w:r>
+      <w:r>
+        <w:fldChar w:fldCharType="begin"/>
+      </w:r>
+      <w:r>
+        <w:instrText xml:space="preserve"> PAGEREF _sec2 \h </w:instrText>
+      </w:r>
+      <w:r>
+        <w:fldChar w:fldCharType="separate"/>
+      </w:r>
+      <w:r>
+        <w:t/>
+      </w:r>
+      <w:r>
+        <w:fldChar w:fldCharType="end"/>
+      </w:r>
+    </w:p>
+    <w:p>
+      <w:pPr>
+        <w:tabs>
+          <w:tab w:pos="9411" w:val="right" w:leader="dot"/>
+        </w:tabs>
+        <w:spacing w:after="80" w:before="0"/>
+        <w:ind w:left="340"/>
+      </w:pPr>
+      <w:hyperlink w:anchor="_sec3">
+        <w:r>
+          <w:rPr>
+            <w:i/>
+          </w:rPr>
+          <w:t xml:space="preserve">Government</w:t>
+        </w:r>
+      </w:hyperlink>
+      <w:r>
+        <w:tab/>
+      </w:r>
+      <w:r>
+        <w:fldChar w:fldCharType="begin"/>
+      </w:r>
+      <w:r>
+        <w:instrText xml:space="preserve"> PAGEREF _sec3 \h </w:instrText>
+      </w:r>
+      <w:r>
+        <w:fldChar w:fldCharType="separate"/>
+      </w:r>
+      <w:r>
+        <w:t/>
+      </w:r>
+      <w:r>
+        <w:fldChar w:fldCharType="end"/>
+      </w:r>
+    </w:p>
+    <w:p>
+      <w:pPr>
+        <w:tabs>
+          <w:tab w:pos="9411" w:val="right" w:leader="dot"/>
+        </w:tabs>
+        <w:spacing w:after="80" w:before="0"/>
+        <w:ind w:left="340"/>
+      </w:pPr>
+      <w:hyperlink w:anchor="_sec4">
+        <w:r>
+          <w:rPr>
+            <w:i/>
+          </w:rPr>
+          <w:t xml:space="preserve">Economy</w:t>
+        </w:r>
+      </w:hyperlink>
+      <w:r>
+        <w:tab/>
+      </w:r>
+      <w:r>
+        <w:fldChar w:fldCharType="begin"/>
+      </w:r>
+      <w:r>
+        <w:instrText xml:space="preserve"> PAGEREF _sec4 \h </w:instrText>
+      </w:r>
+      <w:r>
+        <w:fldChar w:fldCharType="separate"/>
+      </w:r>
+      <w:r>
+        <w:t/>
+      </w:r>
+      <w:r>
+        <w:fldChar w:fldCharType="end"/>
+      </w:r>
+    </w:p>
+    <w:p>
+      <w:pPr>
+        <w:tabs>
+          <w:tab w:pos="9411" w:val="right" w:leader="dot"/>
+        </w:tabs>
+        <w:spacing w:after="80" w:before="0"/>
+        <w:ind w:left="340"/>
+      </w:pPr>
+      <w:hyperlink w:anchor="_sec5">
+        <w:r>
+          <w:rPr>
+            <w:i/>
+          </w:rPr>
+          <w:t xml:space="preserve">Disease Prevalence</w:t>
+        </w:r>
+      </w:hyperlink>
+      <w:r>
+        <w:tab/>
+      </w:r>
+      <w:r>
+        <w:fldChar w:fldCharType="begin"/>
+      </w:r>
+      <w:r>
+        <w:instrText xml:space="preserve"> PAGEREF _sec5 \h </w:instrText>
+      </w:r>
+      <w:r>
+        <w:fldChar w:fldCharType="separate"/>
+      </w:r>
+      <w:r>
+        <w:t/>
+      </w:r>
+      <w:r>
+        <w:fldChar w:fldCharType="end"/>
+      </w:r>
+    </w:p>
+    <w:p>
+      <w:pPr>
+        <w:tabs>
+          <w:tab w:pos="9411" w:val="right" w:leader="dot"/>
+        </w:tabs>
+        <w:spacing w:after="120" w:before="160"/>
+        <w:ind w:left="0"/>
+      </w:pPr>
+      <w:hyperlink w:anchor="_sec6">
+        <w:r>
+          <w:rPr>
+            <w:b/>
+          </w:rPr>
+          <w:t xml:space="preserve">China Health System</w:t>
+        </w:r>
+      </w:hyperlink>
+      <w:r>
+        <w:tab/>
+      </w:r>
+      <w:r>
+        <w:fldChar w:fldCharType="begin"/>
+      </w:r>
+      <w:r>
+        <w:instrText xml:space="preserve"> PAGEREF _sec6 \h </w:instrText>
+      </w:r>
+      <w:r>
+        <w:fldChar w:fldCharType="separate"/>
+      </w:r>
+      <w:r>
+        <w:t/>
+      </w:r>
+      <w:r>
+        <w:fldChar w:fldCharType="end"/>
+      </w:r>
+    </w:p>
+    <w:p>
+      <w:pPr>
+        <w:tabs>
+          <w:tab w:pos="9411" w:val="right" w:leader="dot"/>
+        </w:tabs>
+        <w:spacing w:after="80" w:before="0"/>
+        <w:ind w:left="340"/>
+      </w:pPr>
+      <w:hyperlink w:anchor="_sec7">
+        <w:r>
+          <w:rPr>
+            <w:i/>
+          </w:rPr>
+          <w:t xml:space="preserve">Public Healthcare System</w:t>
+        </w:r>
+      </w:hyperlink>
+      <w:r>
+        <w:tab/>
+      </w:r>
+      <w:r>
+        <w:fldChar w:fldCharType="begin"/>
+      </w:r>
+      <w:r>
+        <w:instrText xml:space="preserve"> PAGEREF _sec7 \h </w:instrText>
+      </w:r>
+      <w:r>
+        <w:fldChar w:fldCharType="separate"/>
+      </w:r>
+      <w:r>
+        <w:t/>
+      </w:r>
+      <w:r>
+        <w:fldChar w:fldCharType="end"/>
+      </w:r>
+    </w:p>
+    <w:p>
+      <w:pPr>
+        <w:tabs>
+          <w:tab w:pos="9411" w:val="right" w:leader="dot"/>
+        </w:tabs>
+        <w:spacing w:after="80" w:before="0"/>
+        <w:ind w:left="340"/>
+      </w:pPr>
+      <w:hyperlink w:anchor="_sec8">
+        <w:r>
+          <w:rPr>
+            <w:i/>
+          </w:rPr>
+          <w:t xml:space="preserve">Private Healthcare System</w:t>
+        </w:r>
+      </w:hyperlink>
+      <w:r>
+        <w:tab/>
+      </w:r>
+      <w:r>
+        <w:fldChar w:fldCharType="begin"/>
+      </w:r>
+      <w:r>
+        <w:instrText xml:space="preserve"> PAGEREF _sec8 \h </w:instrText>
+      </w:r>
+      <w:r>
+        <w:fldChar w:fldCharType="separate"/>
+      </w:r>
+      <w:r>
+        <w:t/>
+      </w:r>
+      <w:r>
+        <w:fldChar w:fldCharType="end"/>
+      </w:r>
+    </w:p>
+    <w:p>
+      <w:pPr>
+        <w:tabs>
+          <w:tab w:pos="9411" w:val="right" w:leader="dot"/>
+        </w:tabs>
+        <w:spacing w:after="80" w:before="0"/>
+        <w:ind w:left="340"/>
+      </w:pPr>
+      <w:hyperlink w:anchor="_sec9">
+        <w:r>
+          <w:rPr>
+            <w:i/>
+          </w:rPr>
+          <w:t xml:space="preserve">Healthcare Financing</w:t>
+        </w:r>
+      </w:hyperlink>
+      <w:r>
+        <w:tab/>
+      </w:r>
+      <w:r>
+        <w:fldChar w:fldCharType="begin"/>
+      </w:r>
+      <w:r>
+        <w:instrText xml:space="preserve"> PAGEREF _sec9 \h </w:instrText>
+      </w:r>
+      <w:r>
+        <w:fldChar w:fldCharType="separate"/>
+      </w:r>
+      <w:r>
+        <w:t/>
+      </w:r>
+      <w:r>
+        <w:fldChar w:fldCharType="end"/>
+      </w:r>
+    </w:p>
+    <w:p>
+      <w:pPr>
+        <w:tabs>
+          <w:tab w:pos="9411" w:val="right" w:leader="dot"/>
+        </w:tabs>
+        <w:spacing w:after="80" w:before="0"/>
+        <w:ind w:left="340"/>
+      </w:pPr>
+      <w:hyperlink w:anchor="_sec10">
+        <w:r>
+          <w:rPr>
+            <w:i/>
+          </w:rPr>
+          <w:t xml:space="preserve">Workforce</w:t>
+        </w:r>
+      </w:hyperlink>
+      <w:r>
+        <w:tab/>
+      </w:r>
+      <w:r>
+        <w:fldChar w:fldCharType="begin"/>
+      </w:r>
+      <w:r>
+        <w:instrText xml:space="preserve"> PAGEREF _sec10 \h </w:instrText>
+      </w:r>
+      <w:r>
+        <w:fldChar w:fldCharType="separate"/>
+      </w:r>
+      <w:r>
+        <w:t/>
+      </w:r>
+      <w:r>
+        <w:fldChar w:fldCharType="end"/>
+      </w:r>
+    </w:p>
+    <w:p>
+      <w:pPr>
+        <w:tabs>
+          <w:tab w:pos="9411" w:val="right" w:leader="dot"/>
+        </w:tabs>
+        <w:spacing w:after="80" w:before="0"/>
+        <w:ind w:left="340"/>
+      </w:pPr>
+      <w:hyperlink w:anchor="_sec11">
+        <w:r>
+          <w:rPr>
+            <w:i/>
+          </w:rPr>
+          <w:t xml:space="preserve">Education</w:t>
+        </w:r>
+      </w:hyperlink>
+      <w:r>
+        <w:tab/>
+      </w:r>
+      <w:r>
+        <w:fldChar w:fldCharType="begin"/>
+      </w:r>
+      <w:r>
+        <w:instrText xml:space="preserve"> PAGEREF _sec11 \h </w:instrText>
+      </w:r>
+      <w:r>
+        <w:fldChar w:fldCharType="separate"/>
+      </w:r>
+      <w:r>
+        <w:t/>
+      </w:r>
+      <w:r>
+        <w:fldChar w:fldCharType="end"/>
+      </w:r>
+    </w:p>
+    <w:p>
+      <w:pPr>
+        <w:tabs>
+          <w:tab w:pos="9411" w:val="right" w:leader="dot"/>
+        </w:tabs>
+        <w:spacing w:after="80" w:before="0"/>
+        <w:ind w:left="340"/>
+      </w:pPr>
+      <w:hyperlink w:anchor="_sec12">
+        <w:r>
+          <w:rPr>
+            <w:i/>
+          </w:rPr>
+          <w:t xml:space="preserve">Healthcare Outlook</w:t>
+        </w:r>
+      </w:hyperlink>
+      <w:r>
+        <w:tab/>
+      </w:r>
+      <w:r>
+        <w:fldChar w:fldCharType="begin"/>
+      </w:r>
+      <w:r>
+        <w:instrText xml:space="preserve"> PAGEREF _sec12 \h </w:instrText>
+      </w:r>
+      <w:r>
+        <w:fldChar w:fldCharType="separate"/>
+      </w:r>
+      <w:r>
+        <w:t/>
+      </w:r>
+      <w:r>
+        <w:fldChar w:fldCharType="end"/>
+      </w:r>
+    </w:p>
+    <w:p>
+      <w:pPr>
+        <w:tabs>
+          <w:tab w:pos="9411" w:val="right" w:leader="dot"/>
+        </w:tabs>
+        <w:spacing w:after="80" w:before="0"/>
+        <w:ind w:left="340"/>
+      </w:pPr>
+      <w:hyperlink w:anchor="_sec13">
+        <w:r>
+          <w:rPr>
+            <w:i/>
+          </w:rPr>
+          <w:t xml:space="preserve">Competitive Landscape</w:t>
+        </w:r>
+      </w:hyperlink>
+      <w:r>
+        <w:tab/>
+      </w:r>
+      <w:r>
+        <w:fldChar w:fldCharType="begin"/>
+      </w:r>
+      <w:r>
+        <w:instrText xml:space="preserve"> PAGEREF _sec13 \h </w:instrText>
+      </w:r>
+      <w:r>
+        <w:fldChar w:fldCharType="separate"/>
+      </w:r>
+      <w:r>
+        <w:t/>
+      </w:r>
+      <w:r>
+        <w:fldChar w:fldCharType="end"/>
+      </w:r>
+    </w:p>
+    <w:p>
+      <w:pPr>
+        <w:tabs>
+          <w:tab w:pos="9411" w:val="right" w:leader="dot"/>
+        </w:tabs>
+        <w:spacing w:after="120" w:before="160"/>
+        <w:ind w:left="0"/>
+      </w:pPr>
+      <w:hyperlink w:anchor="_sec14">
+        <w:r>
+          <w:rPr>
+            <w:b/>
+          </w:rPr>
+          <w:t xml:space="preserve">Recent Developments</w:t>
+        </w:r>
+      </w:hyperlink>
+      <w:r>
+        <w:tab/>
+      </w:r>
+      <w:r>
+        <w:fldChar w:fldCharType="begin"/>
+      </w:r>
+      <w:r>
+        <w:instrText xml:space="preserve"> PAGEREF _sec14 \h </w:instrText>
+      </w:r>
+      <w:r>
+        <w:fldChar w:fldCharType="separate"/>
+      </w:r>
+      <w:r>
+        <w:t/>
+      </w:r>
+      <w:r>
+        <w:fldChar w:fldCharType="end"/>
+      </w:r>
+    </w:p>
+    <w:p>
+      <w:pPr>
+        <w:tabs>
+          <w:tab w:pos="9411" w:val="right" w:leader="dot"/>
+        </w:tabs>
+        <w:spacing w:after="120" w:before="160"/>
+        <w:ind w:left="0"/>
+      </w:pPr>
+      <w:hyperlink w:anchor="_sec15">
+        <w:r>
+          <w:rPr>
+            <w:b/>
+          </w:rPr>
+          <w:t xml:space="preserve">CSI Assessment</w:t>
+        </w:r>
+      </w:hyperlink>
+      <w:r>
+        <w:tab/>
+      </w:r>
+      <w:r>
+        <w:fldChar w:fldCharType="begin"/>
+      </w:r>
+      <w:r>
+        <w:instrText xml:space="preserve"> PAGEREF _sec15 \h </w:instrText>
+      </w:r>
+      <w:r>
+        <w:fldChar w:fldCharType="separate"/>
+      </w:r>
+      <w:r>
+        <w:t/>
+      </w:r>
+      <w:r>
+        <w:fldChar w:fldCharType="end"/>
       </w:r>
     </w:p>
     <w:p>
@@ -52,9 +642,11 @@
       <w:pPr>
         <w:pStyle w:val="Heading1"/>
       </w:pPr>
+      <w:bookmarkStart w:id="1" w:name="_sec1"/>
       <w:r>
         <w:t>Country Overview</w:t>
       </w:r>
+      <w:bookmarkEnd w:id="1"/>
     </w:p>
     <w:p>
       <w:pPr>
@@ -68,9 +660,11 @@
       <w:pPr>
         <w:pStyle w:val="Heading2"/>
       </w:pPr>
+      <w:bookmarkStart w:id="2" w:name="_sec2"/>
       <w:r>
         <w:t>Population and Demographics</w:t>
       </w:r>
+      <w:bookmarkEnd w:id="2"/>
     </w:p>
     <w:tbl>
       <w:tblPr>
@@ -404,17 +998,13 @@
           <w:tcPr>
             <w:tcW w:type="dxa" w:w="2436"/>
           </w:tcPr>
-          <w:p>
-            <w:r/>
-          </w:p>
+          <w:p/>
         </w:tc>
         <w:tc>
           <w:tcPr>
             <w:tcW w:type="dxa" w:w="2436"/>
           </w:tcPr>
-          <w:p>
-            <w:r/>
-          </w:p>
+          <w:p/>
         </w:tc>
       </w:tr>
     </w:tbl>
@@ -427,79 +1017,102 @@
       <w:r>
         <w:t>China's population is approximately 1.405 billion as of 2025 and is now in decline, with a population growth rate of about negative 0.24 percent and a fertility rate of roughly 0.93 births per woman, well below replacement level. That demographic trajectory, an aging, shrinking population layered onto a still-developing per-capita income base, is a central driver of the healthcare reforms described later in this profile: it is a major reason the government is trying to shift the health system toward prevention, chronic disease management, and primary care rather than continuing to expand hospital-based acute treatment capacity.</w:t>
       </w:r>
-    </w:p>
-    <w:p>
-      <w:pPr>
-        <w:spacing w:before="0" w:after="240"/>
-      </w:pPr>
       <w:r>
         <w:rPr>
-          <w:i/>
-          <w:color w:val="6E6E6E"/>
-          <w:sz w:val="17"/>
+          <w:color w:val="B31822"/>
+          <w:vertAlign w:val="superscript"/>
         </w:rPr>
-        <w:t>Sources: CIA World Factbook, China; World Bank, China Population and Demographic Indicators; IMF World Economic Outlook Database</w:t>
+        <w:t>1,</w:t>
+      </w:r>
+      <w:r>
+        <w:rPr>
+          <w:color w:val="B31822"/>
+          <w:vertAlign w:val="superscript"/>
+        </w:rPr>
+        <w:t>2,</w:t>
+      </w:r>
+      <w:r>
+        <w:rPr>
+          <w:color w:val="B31822"/>
+          <w:vertAlign w:val="superscript"/>
+        </w:rPr>
+        <w:t>3</w:t>
       </w:r>
     </w:p>
     <w:p>
       <w:pPr>
         <w:pStyle w:val="Heading2"/>
       </w:pPr>
+      <w:bookmarkStart w:id="3" w:name="_sec3"/>
       <w:r>
         <w:t>Government</w:t>
       </w:r>
+      <w:bookmarkEnd w:id="3"/>
     </w:p>
     <w:p>
       <w:r>
         <w:t>China is governed as a one-party state under the Chinese Communist Party, with power concentrated in the Politburo Standing Committee and General Secretary Xi Jinping, who also holds the state presidency and chairs the Central Military Commission. Formal state institutions, including the National People's Congress, the State Council led by Premier Li Qiang, and the judiciary, operate under Party direction rather than as independent branches of government. China is organized into provinces, autonomous regions, and municipalities directly under central control (Beijing, Shanghai, Tianjin, Chongqing), with substantial policy implementation delegated to provincial and local governments, which is a major reason health policy execution varies so much region to region. Xi Jinping has consolidated authority significantly since taking power in 2012, including through the 2018 removal of presidential term limits, which allows him to remain in office indefinitely and gives long-run initiatives like the current health reform plans unusual continuity.</w:t>
       </w:r>
-    </w:p>
-    <w:p>
-      <w:pPr>
-        <w:spacing w:before="0" w:after="240"/>
-      </w:pPr>
       <w:r>
         <w:rPr>
-          <w:i/>
-          <w:color w:val="6E6E6E"/>
-          <w:sz w:val="17"/>
+          <w:color w:val="B31822"/>
+          <w:vertAlign w:val="superscript"/>
         </w:rPr>
-        <w:t>Sources: CIA World Factbook, China; Wikipedia, Politics of China</w:t>
+        <w:t>1,</w:t>
+      </w:r>
+      <w:r>
+        <w:rPr>
+          <w:color w:val="B31822"/>
+          <w:vertAlign w:val="superscript"/>
+        </w:rPr>
+        <w:t>4</w:t>
       </w:r>
     </w:p>
     <w:p>
       <w:pPr>
         <w:pStyle w:val="Heading2"/>
       </w:pPr>
+      <w:bookmarkStart w:id="4" w:name="_sec4"/>
       <w:r>
         <w:t>Economy</w:t>
       </w:r>
+      <w:bookmarkEnd w:id="4"/>
     </w:p>
     <w:p>
       <w:r>
         <w:t>China has the world's second-largest economy by nominal GDP and the largest by purchasing power parity, built over four decades of market reform from a largely agrarian, centrally planned system into a manufacturing and export powerhouse. Growth has slowed to roughly 4 to 5 percent annually in the mid-2020s amid a prolonged property-sector downturn, elevated local-government debt, weak domestic consumption, and demographic headwinds from a shrinking workforce. The 15th Five-Year Plan, covering 2026 to 2030, emphasizes technological self-sufficiency and an AI-driven industrial strategy that extends into healthcare, alongside efforts to rebalance the economy toward domestic consumption. A companion 15th Five-Year Plan for National Health sets a target of raising average life expectancy to 80 by 2030, seeks to curb further expansion of tertiary mega-hospitals, and calls for accelerated AI adoption across the health and pharmaceutical sectors. Healthy China 2030, launched in 2016, remains the umbrella strategy shifting the health system's orientation from treatment toward prevention and long-term health management.</w:t>
       </w:r>
-    </w:p>
-    <w:p>
-      <w:pPr>
-        <w:spacing w:before="0" w:after="240"/>
-      </w:pPr>
       <w:r>
         <w:rPr>
-          <w:i/>
-          <w:color w:val="6E6E6E"/>
-          <w:sz w:val="17"/>
+          <w:color w:val="B31822"/>
+          <w:vertAlign w:val="superscript"/>
         </w:rPr>
-        <w:t>Sources: Wikipedia, Economy of China; Caixin Global, coverage of China's 15th Five-Year Plan for National Health; Bayer Global, Healthy China 2030</w:t>
+        <w:t>5,</w:t>
+      </w:r>
+      <w:r>
+        <w:rPr>
+          <w:color w:val="B31822"/>
+          <w:vertAlign w:val="superscript"/>
+        </w:rPr>
+        <w:t>6,</w:t>
+      </w:r>
+      <w:r>
+        <w:rPr>
+          <w:color w:val="B31822"/>
+          <w:vertAlign w:val="superscript"/>
+        </w:rPr>
+        <w:t>7</w:t>
       </w:r>
     </w:p>
     <w:p>
       <w:pPr>
         <w:pStyle w:val="Heading2"/>
       </w:pPr>
+      <w:bookmarkStart w:id="5" w:name="_sec5"/>
       <w:r>
         <w:t>Disease Prevalence</w:t>
       </w:r>
+      <w:bookmarkEnd w:id="5"/>
     </w:p>
     <w:tbl>
       <w:tblPr>
@@ -693,17 +1306,13 @@
           <w:tcPr>
             <w:tcW w:type="dxa" w:w="2436"/>
           </w:tcPr>
-          <w:p>
-            <w:r/>
-          </w:p>
+          <w:p/>
         </w:tc>
         <w:tc>
           <w:tcPr>
             <w:tcW w:type="dxa" w:w="2436"/>
           </w:tcPr>
-          <w:p>
-            <w:r/>
-          </w:p>
+          <w:p/>
         </w:tc>
       </w:tr>
     </w:tbl>
@@ -713,25 +1322,30 @@
       </w:pPr>
     </w:p>
     <w:p>
-      <w:pPr>
-        <w:spacing w:before="0" w:after="240"/>
-      </w:pPr>
       <w:r>
         <w:rPr>
-          <w:i/>
-          <w:color w:val="6E6E6E"/>
-          <w:sz w:val="17"/>
+          <w:color w:val="B31822"/>
+          <w:vertAlign w:val="superscript"/>
         </w:rPr>
-        <w:t>Sources: Institute for Health Metrics and Evaluation (IHME), Global Burden of Disease Study, China; WHO Global Health Observatory, China</w:t>
+        <w:t>8,</w:t>
+      </w:r>
+      <w:r>
+        <w:rPr>
+          <w:color w:val="B31822"/>
+          <w:vertAlign w:val="superscript"/>
+        </w:rPr>
+        <w:t>9</w:t>
       </w:r>
     </w:p>
     <w:p>
       <w:pPr>
         <w:pStyle w:val="Heading1"/>
       </w:pPr>
+      <w:bookmarkStart w:id="6" w:name="_sec6"/>
       <w:r>
         <w:t>China Health System</w:t>
       </w:r>
+      <w:bookmarkEnd w:id="6"/>
     </w:p>
     <w:p>
       <w:pPr>
@@ -745,61 +1359,83 @@
       <w:pPr>
         <w:pStyle w:val="Heading2"/>
       </w:pPr>
+      <w:bookmarkStart w:id="7" w:name="_sec7"/>
       <w:r>
         <w:t>Public Healthcare System</w:t>
       </w:r>
+      <w:bookmarkEnd w:id="7"/>
     </w:p>
     <w:p>
       <w:r>
         <w:t>China's public health system is a tiered network of government-run facilities, from township and community health centers up through county and district hospitals to tertiary Grade A hospitals, overseen by the National Health Commission. Nominal universal coverage is provided through the Urban Employee Basic Medical Insurance and Urban-Rural Resident Basic Medical Insurance schemes, supplemented by medical assistance programs for low-income populations. Utilization is heavily skewed toward tertiary mega-hospitals, which draw patients away from lower-tier facilities even for routine care that a community clinic could handle. The new Five-Year Health Plan aims to correct this pattern and push more capacity toward primary care, in part through AI-enabled remote diagnostics that already handle tens of millions of imaging cases annually at the county level.</w:t>
       </w:r>
-    </w:p>
-    <w:p>
-      <w:pPr>
-        <w:spacing w:before="0" w:after="240"/>
-      </w:pPr>
       <w:r>
         <w:rPr>
-          <w:i/>
-          <w:color w:val="6E6E6E"/>
-          <w:sz w:val="17"/>
+          <w:color w:val="B31822"/>
+          <w:vertAlign w:val="superscript"/>
         </w:rPr>
-        <w:t>Sources: Caixin Global, coverage of China's 15th Five-Year Plan for National Health; Xinhua, China advances AI-powered digital healthcare; State Council of China, health sector progress reporting</w:t>
+        <w:t>6,</w:t>
+      </w:r>
+      <w:r>
+        <w:rPr>
+          <w:color w:val="B31822"/>
+          <w:vertAlign w:val="superscript"/>
+        </w:rPr>
+        <w:t>10,</w:t>
+      </w:r>
+      <w:r>
+        <w:rPr>
+          <w:color w:val="B31822"/>
+          <w:vertAlign w:val="superscript"/>
+        </w:rPr>
+        <w:t>11</w:t>
       </w:r>
     </w:p>
     <w:p>
       <w:pPr>
         <w:pStyle w:val="Heading2"/>
       </w:pPr>
+      <w:bookmarkStart w:id="8" w:name="_sec8"/>
       <w:r>
         <w:t>Private Healthcare System</w:t>
       </w:r>
+      <w:bookmarkEnd w:id="8"/>
     </w:p>
     <w:p>
       <w:r>
         <w:t>China's private and foreign-invested health sector remains small relative to the public system but is expanding under real policy liberalization. Beijing began piloting wholly foreign-owned hospitals in Shanghai and other cities starting in 2025, opening a path for international operators that previously had to structure their entry as joint ventures with a Chinese partner. Established international players include IHH Healthcare's Parkway Shanghai operation, which marked its 20th year in the Chinese market in December 2024 and announced plans for a new ambulatory flagship care center in downtown Shanghai targeted for a 2025 opening, alongside a range of premium and expatriate-focused clinics and hospitals in major cities such as Shanghai, Beijing, and Shenzhen. US academic medical centers have pursued a mix of equity joint ventures, management contracts, consulting agreements, and branded partnerships in China with mixed and uneven results, ranging from UPMC's hospital-management joint venture with Wanda Group to smaller consulting relationships run by institutions such as Johns Hopkins Medicine International. Several ventures announced with fanfare in the late 2010s have since stalled, scaled back, or gone quiet in public reporting, which underscores the operational and regulatory difficulty of sustaining foreign-branded care delivery in China over the long run.</w:t>
       </w:r>
-    </w:p>
-    <w:p>
-      <w:pPr>
-        <w:spacing w:before="0" w:after="240"/>
-      </w:pPr>
       <w:r>
         <w:rPr>
-          <w:i/>
-          <w:color w:val="6E6E6E"/>
-          <w:sz w:val="17"/>
+          <w:color w:val="B31822"/>
+          <w:vertAlign w:val="superscript"/>
         </w:rPr>
-        <w:t>Sources: Natural Law Review, China Relaxes Foreign Investment Restrictions in Healthcare Sector; Global Times, Shanghai tries out foreign-funded hospitals; Chinadaily, IHH Healthcare 20th anniversary coverage, December 2024</w:t>
+        <w:t>12,</w:t>
+      </w:r>
+      <w:r>
+        <w:rPr>
+          <w:color w:val="B31822"/>
+          <w:vertAlign w:val="superscript"/>
+        </w:rPr>
+        <w:t>13,</w:t>
+      </w:r>
+      <w:r>
+        <w:rPr>
+          <w:color w:val="B31822"/>
+          <w:vertAlign w:val="superscript"/>
+        </w:rPr>
+        <w:t>14</w:t>
       </w:r>
     </w:p>
     <w:p>
       <w:pPr>
         <w:pStyle w:val="Heading2"/>
       </w:pPr>
+      <w:bookmarkStart w:id="9" w:name="_sec9"/>
       <w:r>
         <w:t>Healthcare Financing</w:t>
       </w:r>
+      <w:bookmarkEnd w:id="9"/>
     </w:p>
     <w:tbl>
       <w:tblPr>
@@ -894,27 +1530,30 @@
       <w:r>
         <w:t>Coverage under the Urban Employee and Urban-Rural Resident Basic Medical Insurance schemes is nominally near-universal, but significant out-of-pocket costs and reimbursement gaps persist for tertiary and specialty care, which remains a central financing concern as the government pushes the system toward primary care and prevention.</w:t>
       </w:r>
-    </w:p>
-    <w:p>
-      <w:pPr>
-        <w:spacing w:before="0" w:after="240"/>
-      </w:pPr>
       <w:r>
         <w:rPr>
-          <w:i/>
-          <w:color w:val="6E6E6E"/>
-          <w:sz w:val="17"/>
+          <w:color w:val="B31822"/>
+          <w:vertAlign w:val="superscript"/>
         </w:rPr>
-        <w:t>Sources: WHO Global Health Expenditure Database; National Health Commission of China, annual statistical bulletins</w:t>
+        <w:t>15,</w:t>
+      </w:r>
+      <w:r>
+        <w:rPr>
+          <w:color w:val="B31822"/>
+          <w:vertAlign w:val="superscript"/>
+        </w:rPr>
+        <w:t>16</w:t>
       </w:r>
     </w:p>
     <w:p>
       <w:pPr>
         <w:pStyle w:val="Heading2"/>
       </w:pPr>
+      <w:bookmarkStart w:id="10" w:name="_sec10"/>
       <w:r>
         <w:t>Workforce</w:t>
       </w:r>
+      <w:bookmarkEnd w:id="10"/>
     </w:p>
     <w:tbl>
       <w:tblPr>
@@ -1108,17 +1747,13 @@
           <w:tcPr>
             <w:tcW w:type="dxa" w:w="2436"/>
           </w:tcPr>
-          <w:p>
-            <w:r/>
-          </w:p>
+          <w:p/>
         </w:tc>
         <w:tc>
           <w:tcPr>
             <w:tcW w:type="dxa" w:w="2436"/>
           </w:tcPr>
-          <w:p>
-            <w:r/>
-          </w:p>
+          <w:p/>
         </w:tc>
       </w:tr>
     </w:tbl>
@@ -1131,79 +1766,102 @@
       <w:r>
         <w:t>The range in national physician density reflects differing source and definitional bases: a Statista-sourced figure runs closer to 3.15 per 1,000, while other national data put the figure nearer 3.4 per 1,000. Either way, the urban-rural gap is the more consequential distribution problem for care access than the national average alone suggests.</w:t>
       </w:r>
-    </w:p>
-    <w:p>
-      <w:pPr>
-        <w:spacing w:before="0" w:after="240"/>
-      </w:pPr>
       <w:r>
         <w:rPr>
-          <w:i/>
-          <w:color w:val="6E6E6E"/>
-          <w:sz w:val="17"/>
+          <w:color w:val="B31822"/>
+          <w:vertAlign w:val="superscript"/>
         </w:rPr>
-        <w:t>Sources: Statista, China healthcare workforce statistics; National Health Commission of China, health statistics yearbook; OECD Health Statistics</w:t>
+        <w:t>17,</w:t>
+      </w:r>
+      <w:r>
+        <w:rPr>
+          <w:color w:val="B31822"/>
+          <w:vertAlign w:val="superscript"/>
+        </w:rPr>
+        <w:t>18,</w:t>
+      </w:r>
+      <w:r>
+        <w:rPr>
+          <w:color w:val="B31822"/>
+          <w:vertAlign w:val="superscript"/>
+        </w:rPr>
+        <w:t>19</w:t>
       </w:r>
     </w:p>
     <w:p>
       <w:pPr>
         <w:pStyle w:val="Heading2"/>
       </w:pPr>
+      <w:bookmarkStart w:id="11" w:name="_sec11"/>
       <w:r>
         <w:t>Education</w:t>
       </w:r>
+      <w:bookmarkEnd w:id="11"/>
     </w:p>
     <w:p>
       <w:r>
         <w:t>A 2013 reform introduced the five-plus-three model of medical education: five years of undergraduate medical study followed by three years of standardized residency training in one of 36 recognized specialties. By the end of 2014, roughly 8,500 residency programs across 559 hospitals had enrolled approximately 55,000 residents, with a policy goal that by 2020 all physicians applying for clinical positions would have completed standardized residency training. China also retains an eight-year MD track at a small number of elite institutions and a three-plus-two pathway for training lower-tier practitioners who serve primary and rural care needs.</w:t>
       </w:r>
-    </w:p>
-    <w:p>
-      <w:pPr>
-        <w:spacing w:before="0" w:after="240"/>
-      </w:pPr>
       <w:r>
         <w:rPr>
-          <w:i/>
-          <w:color w:val="6E6E6E"/>
-          <w:sz w:val="17"/>
+          <w:color w:val="B31822"/>
+          <w:vertAlign w:val="superscript"/>
         </w:rPr>
-        <w:t>Sources: The Lancet, Doctors in China: improving quality through modernisation of residency education; BMC Medical Education, Medical education in China: progress in the past 70 years</w:t>
+        <w:t>20,</w:t>
+      </w:r>
+      <w:r>
+        <w:rPr>
+          <w:color w:val="B31822"/>
+          <w:vertAlign w:val="superscript"/>
+        </w:rPr>
+        <w:t>21</w:t>
       </w:r>
     </w:p>
     <w:p>
       <w:pPr>
         <w:pStyle w:val="Heading2"/>
       </w:pPr>
+      <w:bookmarkStart w:id="12" w:name="_sec12"/>
       <w:r>
         <w:t>Healthcare Outlook</w:t>
       </w:r>
+      <w:bookmarkEnd w:id="12"/>
     </w:p>
     <w:p>
       <w:r>
         <w:t>The 15th Five-Year Plan for National Health, covering 2026 to 2030, targets raising life expectancy to 80 by 2030, curbing further mega-hospital growth, and lays out 24 key tasks to modernize care delivery. Artificial intelligence has moved from pilot projects to core infrastructure in Chinese healthcare: as of roughly May 2025, China had released approximately 300 medical large language models, and county-level AI-assisted imaging had handled more than 68 million cases. China's AI+Healthcare implementation plan calls for pilots across 50 hospitals and 500 township clinics, national health-database integration by the end of 2027, and universal primary-care AI adoption at Grade 2 and above hospitals by 2030. DeepSeek's models have been rapidly adopted across tertiary hospitals since early 2025 for clinical decision support. The government's opening to foreign hospital ownership, combined with an aging and increasingly affluent population, points to durable demand for higher-acuity specialty care and continued interest in cross-border clinical collaboration, even as several earlier foreign partnership models have proven difficult to sustain over the long term.</w:t>
       </w:r>
-    </w:p>
-    <w:p>
-      <w:pPr>
-        <w:spacing w:before="0" w:after="240"/>
-      </w:pPr>
       <w:r>
         <w:rPr>
-          <w:i/>
-          <w:color w:val="6E6E6E"/>
-          <w:sz w:val="17"/>
+          <w:color w:val="B31822"/>
+          <w:vertAlign w:val="superscript"/>
         </w:rPr>
-        <w:t>Sources: Caixin Global, coverage of China's 15th Five-Year Plan for National Health; Xinhua / China Focus, China advances AI-powered digital healthcare; STAT News, DeepSeek signals China's rising influence in AI and drug development</w:t>
+        <w:t>6,</w:t>
+      </w:r>
+      <w:r>
+        <w:rPr>
+          <w:color w:val="B31822"/>
+          <w:vertAlign w:val="superscript"/>
+        </w:rPr>
+        <w:t>22,</w:t>
+      </w:r>
+      <w:r>
+        <w:rPr>
+          <w:color w:val="B31822"/>
+          <w:vertAlign w:val="superscript"/>
+        </w:rPr>
+        <w:t>23</w:t>
       </w:r>
     </w:p>
     <w:p>
       <w:pPr>
         <w:pStyle w:val="Heading2"/>
       </w:pPr>
+      <w:bookmarkStart w:id="13" w:name="_sec13"/>
       <w:r>
         <w:t>Competitive Landscape</w:t>
       </w:r>
+      <w:bookmarkEnd w:id="13"/>
     </w:p>
     <w:p>
       <w:r>
@@ -1244,27 +1902,107 @@
       <w:r>
         <w:t>For Cedars-Sinai International, the pattern across these cases is instructive: durable China engagement has tended to favor lower-capital models, consulting, academic exchange, clinical-society collaboration, over the equity joint ventures and branded hospital builds that have more often stalled, been delayed for years, or quietly wound down.</w:t>
       </w:r>
-    </w:p>
-    <w:p>
-      <w:pPr>
-        <w:spacing w:before="0" w:after="240"/>
-      </w:pPr>
       <w:r>
         <w:rPr>
-          <w:i/>
-          <w:color w:val="6E6E6E"/>
-          <w:sz w:val="17"/>
+          <w:color w:val="B31822"/>
+          <w:vertAlign w:val="superscript"/>
         </w:rPr>
-        <w:t>Sources: Post Bulletin (Rochester, MN), Mayo Clinic and WuXi joint venture coverage, February 2024; Fierce Biotech, Mayo Clinic and WuXi AppTec diagnostics joint venture coverage; Cleveland Clinic Newsroom, Luye Medical and Shanghai Luye Lilan Hospital announcements; Cleveland Clinic Newsroom, China in-country representative announcement, November 2022; Concord Medical Services Holdings, SEC Form 20-F filings; Becker's Hospital Review, MD Anderson Asia cancer center collaboration coverage; UCLA Health, China rotation and Guangzhou R&amp;F Hospital collaboration pages; UPMC Media Newsroom, Wanda Group hospital network announcement, 2019; Boston Globe, Mass General Brigham / Brigham Health China hospital venture coverage; Jiahui Health, Mass General Brigham delegation coverage; Northwestern Medicine, The London Clinic international collaboration announcement, 2024; Johns Hopkins Medicine International, China Northwest International Medical Center and Nanjing Drum Tower Hospital pages; Memorial Sloan Kettering Cancer Center Newsroom, MSK-CTONG Symposium announcements</w:t>
+        <w:t>24,</w:t>
+      </w:r>
+      <w:r>
+        <w:rPr>
+          <w:color w:val="B31822"/>
+          <w:vertAlign w:val="superscript"/>
+        </w:rPr>
+        <w:t>25,</w:t>
+      </w:r>
+      <w:r>
+        <w:rPr>
+          <w:color w:val="B31822"/>
+          <w:vertAlign w:val="superscript"/>
+        </w:rPr>
+        <w:t>26,</w:t>
+      </w:r>
+      <w:r>
+        <w:rPr>
+          <w:color w:val="B31822"/>
+          <w:vertAlign w:val="superscript"/>
+        </w:rPr>
+        <w:t>27,</w:t>
+      </w:r>
+      <w:r>
+        <w:rPr>
+          <w:color w:val="B31822"/>
+          <w:vertAlign w:val="superscript"/>
+        </w:rPr>
+        <w:t>28,</w:t>
+      </w:r>
+      <w:r>
+        <w:rPr>
+          <w:color w:val="B31822"/>
+          <w:vertAlign w:val="superscript"/>
+        </w:rPr>
+        <w:t>29,</w:t>
+      </w:r>
+      <w:r>
+        <w:rPr>
+          <w:color w:val="B31822"/>
+          <w:vertAlign w:val="superscript"/>
+        </w:rPr>
+        <w:t>30,</w:t>
+      </w:r>
+      <w:r>
+        <w:rPr>
+          <w:color w:val="B31822"/>
+          <w:vertAlign w:val="superscript"/>
+        </w:rPr>
+        <w:t>31,</w:t>
+      </w:r>
+      <w:r>
+        <w:rPr>
+          <w:color w:val="B31822"/>
+          <w:vertAlign w:val="superscript"/>
+        </w:rPr>
+        <w:t>32,</w:t>
+      </w:r>
+      <w:r>
+        <w:rPr>
+          <w:color w:val="B31822"/>
+          <w:vertAlign w:val="superscript"/>
+        </w:rPr>
+        <w:t>33,</w:t>
+      </w:r>
+      <w:r>
+        <w:rPr>
+          <w:color w:val="B31822"/>
+          <w:vertAlign w:val="superscript"/>
+        </w:rPr>
+        <w:t>34,</w:t>
+      </w:r>
+      <w:r>
+        <w:rPr>
+          <w:color w:val="B31822"/>
+          <w:vertAlign w:val="superscript"/>
+        </w:rPr>
+        <w:t>35,</w:t>
+      </w:r>
+      <w:r>
+        <w:rPr>
+          <w:color w:val="B31822"/>
+          <w:vertAlign w:val="superscript"/>
+        </w:rPr>
+        <w:t>36</w:t>
       </w:r>
     </w:p>
     <w:p>
       <w:pPr>
         <w:pStyle w:val="Heading1"/>
       </w:pPr>
+      <w:bookmarkStart w:id="14" w:name="_sec14"/>
       <w:r>
         <w:t>Recent Developments</w:t>
       </w:r>
+      <w:bookmarkEnd w:id="14"/>
     </w:p>
     <w:p>
       <w:pPr>
@@ -1288,18 +2026,12 @@
       <w:r>
         <w:t>China unveils its 15th Five-Year Plan for National Health (2026-2030), targeting a national life expectancy of 80 by 2030, curbs on further mega-hospital expansion, and 24 key tasks to modernize care delivery, including expanded AI adoption.</w:t>
       </w:r>
-    </w:p>
-    <w:p>
-      <w:pPr>
-        <w:spacing w:before="0" w:after="240"/>
-      </w:pPr>
       <w:r>
         <w:rPr>
-          <w:i/>
-          <w:color w:val="6E6E6E"/>
-          <w:sz w:val="17"/>
+          <w:color w:val="B31822"/>
+          <w:vertAlign w:val="superscript"/>
         </w:rPr>
-        <w:t>Sources: Caixin Global</w:t>
+        <w:t>37</w:t>
       </w:r>
     </w:p>
     <w:p>
@@ -1316,18 +2048,19 @@
       <w:r>
         <w:t>Xinhua-linked coverage reports on China's accelerating AI application in healthcare, citing that as of roughly May 2025 China had released approximately 300 medical large language models and that county-level AI-assisted imaging had processed more than 68 million cases; a related State Council Information Office piece covering similar themes was published March 16, 2026.</w:t>
       </w:r>
-    </w:p>
-    <w:p>
-      <w:pPr>
-        <w:spacing w:before="0" w:after="240"/>
-      </w:pPr>
       <w:r>
         <w:rPr>
-          <w:i/>
-          <w:color w:val="6E6E6E"/>
-          <w:sz w:val="17"/>
+          <w:color w:val="B31822"/>
+          <w:vertAlign w:val="superscript"/>
         </w:rPr>
-        <w:t>Sources: Xinhua / China Focus; State Council Information Office</w:t>
+        <w:t>38,</w:t>
+      </w:r>
+      <w:r>
+        <w:rPr>
+          <w:color w:val="B31822"/>
+          <w:vertAlign w:val="superscript"/>
+        </w:rPr>
+        <w:t>39</w:t>
       </w:r>
     </w:p>
     <w:p>
@@ -1344,18 +2077,19 @@
       <w:r>
         <w:t>Shanghai begins piloting wholly foreign-owned hospitals, opening a new entry path for international health systems that previously required joint-venture structures.</w:t>
       </w:r>
-    </w:p>
-    <w:p>
-      <w:pPr>
-        <w:spacing w:before="0" w:after="240"/>
-      </w:pPr>
       <w:r>
         <w:rPr>
-          <w:i/>
-          <w:color w:val="6E6E6E"/>
-          <w:sz w:val="17"/>
+          <w:color w:val="B31822"/>
+          <w:vertAlign w:val="superscript"/>
         </w:rPr>
-        <w:t>Sources: Global Times; Natural Law Review</w:t>
+        <w:t>40,</w:t>
+      </w:r>
+      <w:r>
+        <w:rPr>
+          <w:color w:val="B31822"/>
+          <w:vertAlign w:val="superscript"/>
+        </w:rPr>
+        <w:t>41</w:t>
       </w:r>
     </w:p>
     <w:p>
@@ -1372,18 +2106,19 @@
       <w:r>
         <w:t>DeepSeek's AI models see rapid adoption across Chinese tertiary hospitals for clinical decision support.</w:t>
       </w:r>
-    </w:p>
-    <w:p>
-      <w:pPr>
-        <w:spacing w:before="0" w:after="240"/>
-      </w:pPr>
       <w:r>
         <w:rPr>
-          <w:i/>
-          <w:color w:val="6E6E6E"/>
-          <w:sz w:val="17"/>
+          <w:color w:val="B31822"/>
+          <w:vertAlign w:val="superscript"/>
         </w:rPr>
-        <w:t>Sources: CNN via KRDO; STAT News</w:t>
+        <w:t>42,</w:t>
+      </w:r>
+      <w:r>
+        <w:rPr>
+          <w:color w:val="B31822"/>
+          <w:vertAlign w:val="superscript"/>
+        </w:rPr>
+        <w:t>43</w:t>
       </w:r>
     </w:p>
     <w:p>
@@ -1400,18 +2135,19 @@
       <w:r>
         <w:t>IHH Healthcare's Parkway Shanghai marks its 20th anniversary in the Chinese market and announces plans to open a new flagship ambulatory care center in downtown Shanghai, targeted for 2025.</w:t>
       </w:r>
-    </w:p>
-    <w:p>
-      <w:pPr>
-        <w:spacing w:before="0" w:after="240"/>
-      </w:pPr>
       <w:r>
         <w:rPr>
-          <w:i/>
-          <w:color w:val="6E6E6E"/>
-          <w:sz w:val="17"/>
+          <w:color w:val="B31822"/>
+          <w:vertAlign w:val="superscript"/>
         </w:rPr>
-        <w:t>Sources: Chinadaily; IHH Healthcare Newsroom</w:t>
+        <w:t>44,</w:t>
+      </w:r>
+      <w:r>
+        <w:rPr>
+          <w:color w:val="B31822"/>
+          <w:vertAlign w:val="superscript"/>
+        </w:rPr>
+        <w:t>45</w:t>
       </w:r>
     </w:p>
     <w:p>
@@ -1428,18 +2164,19 @@
       <w:r>
         <w:t>Mayo Clinic opens its first office in China, even as the separate WuXi Diagnostics joint venture's Rochester, Minnesota research facility has closed and the relationship faces new political scrutiny; Mayo has stated the joint venture itself still exists.</w:t>
       </w:r>
-    </w:p>
-    <w:p>
-      <w:pPr>
-        <w:spacing w:before="0" w:after="240"/>
-      </w:pPr>
       <w:r>
         <w:rPr>
-          <w:i/>
-          <w:color w:val="6E6E6E"/>
-          <w:sz w:val="17"/>
+          <w:color w:val="B31822"/>
+          <w:vertAlign w:val="superscript"/>
         </w:rPr>
-        <w:t>Sources: Yahoo News (Mayo Clinic release); Post Bulletin</w:t>
+        <w:t>46,</w:t>
+      </w:r>
+      <w:r>
+        <w:rPr>
+          <w:color w:val="B31822"/>
+          <w:vertAlign w:val="superscript"/>
+        </w:rPr>
+        <w:t>47</w:t>
       </w:r>
     </w:p>
     <w:p>
@@ -1451,9 +2188,11 @@
       <w:pPr>
         <w:pStyle w:val="Heading1"/>
       </w:pPr>
+      <w:bookmarkStart w:id="15" w:name="_sec15"/>
       <w:r>
         <w:t>CSI Assessment</w:t>
       </w:r>
+      <w:bookmarkEnd w:id="15"/>
     </w:p>
     <w:p>
       <w:pPr>
@@ -1470,7 +2209,7 @@
           <w:color w:val="6E6E6E"/>
           <w:sz w:val="20"/>
         </w:rPr>
-        <w:t>Everything below comes from Cedars-Sinai's internal data (patient referral records, finance, relationship history) and human judgment, not from the research agent. Fields left blank are marked and must be completed by the analyst before this profile is used.</w:t>
+        <w:t>Everything below comes from Cedars-Sinai's internal data (patient referral records, finance, relationship history) and human judgment, not from the research agents. Fields left blank are marked and must be completed by the analyst before this profile is used.</w:t>
       </w:r>
     </w:p>
     <w:p>
@@ -1621,6 +2360,7 @@
       </w:r>
     </w:p>
     <w:sectPr>
+      <w:footerReference w:type="default" r:id="rId9"/>
       <w:pgSz w:w="12240" w:h="15840"/>
       <w:pgMar w:top="1020" w:right="1247" w:bottom="1020" w:left="1247" w:header="720" w:footer="720" w:gutter="0"/>
       <w:cols w:space="720"/>
@@ -1628,6 +2368,52 @@
     </w:sectPr>
   </w:body>
 </w:document>
+</file>
+
+<file path=word/footer1.xml><?xml version="1.0" encoding="utf-8"?>
+<w:ftr xmlns:m="http://schemas.openxmlformats.org/officeDocument/2006/math" xmlns:mc="http://schemas.openxmlformats.org/markup-compatibility/2006" xmlns:mo="http://schemas.microsoft.com/office/mac/office/2008/main" xmlns:mv="urn:schemas-microsoft-com:mac:vml" xmlns:o="urn:schemas-microsoft-com:office:office" xmlns:r="http://schemas.openxmlformats.org/officeDocument/2006/relationships" xmlns:v="urn:schemas-microsoft-com:vml" xmlns:w10="urn:schemas-microsoft-com:office:word" xmlns:w14="http://schemas.microsoft.com/office/word/2010/wordml" xmlns:w="http://schemas.openxmlformats.org/wordprocessingml/2006/main" xmlns:wne="http://schemas.microsoft.com/office/word/2006/wordml" xmlns:wp14="http://schemas.microsoft.com/office/word/2010/wordprocessingDrawing" xmlns:wp="http://schemas.openxmlformats.org/drawingml/2006/wordprocessingDrawing" xmlns:wpc="http://schemas.microsoft.com/office/word/2010/wordprocessingCanvas" xmlns:wpg="http://schemas.microsoft.com/office/word/2010/wordprocessingGroup" xmlns:wpi="http://schemas.microsoft.com/office/word/2010/wordprocessingInk" xmlns:wps="http://schemas.microsoft.com/office/word/2010/wordprocessingShape" mc:Ignorable="w14 wp14">
+  <w:p>
+    <w:pPr>
+      <w:pStyle w:val="Footer"/>
+      <w:jc w:val="right"/>
+    </w:pPr>
+    <w:r>
+      <w:rPr>
+        <w:color w:val="6E6E6E"/>
+        <w:sz w:val="18"/>
+      </w:rPr>
+      <w:fldChar w:fldCharType="begin"/>
+    </w:r>
+    <w:r>
+      <w:rPr>
+        <w:color w:val="6E6E6E"/>
+        <w:sz w:val="18"/>
+      </w:rPr>
+      <w:instrText xml:space="preserve"> PAGE </w:instrText>
+    </w:r>
+    <w:r>
+      <w:rPr>
+        <w:color w:val="6E6E6E"/>
+        <w:sz w:val="18"/>
+      </w:rPr>
+      <w:fldChar w:fldCharType="separate"/>
+    </w:r>
+    <w:r>
+      <w:rPr>
+        <w:color w:val="6E6E6E"/>
+        <w:sz w:val="18"/>
+      </w:rPr>
+      <w:t/>
+    </w:r>
+    <w:r>
+      <w:rPr>
+        <w:color w:val="6E6E6E"/>
+        <w:sz w:val="18"/>
+      </w:rPr>
+      <w:fldChar w:fldCharType="end"/>
+    </w:r>
+  </w:p>
+</w:ftr>
 </file>
 
 <file path=word/numbering.xml><?xml version="1.0" encoding="utf-8"?>
@@ -2528,13 +3314,8 @@
       <w:numPr>
         <w:numId w:val="1"/>
       </w:numPr>
-      <w:spacing w:after="80" w:line="276" w:lineRule="auto"/>
       <w:contextualSpacing/>
     </w:pPr>
-    <w:rPr>
-      <w:rFonts w:ascii="Calibri" w:hAnsi="Calibri"/>
-      <w:sz w:val="22"/>
-    </w:rPr>
   </w:style>
   <w:style w:type="paragraph" w:styleId="ListBullet2">
     <w:name w:val="List Bullet 2"/>

</xml_diff>